<commit_message>
Report: link the public repository instead of the placeholder
</commit_message>
<xml_diff>
--- a/report/REPORT2_second_project_report.docx
+++ b/report/REPORT2_second_project_report.docx
@@ -34,27 +34,7 @@
         <w:rPr>
           <w:sz w:val="19"/>
         </w:rPr>
-        <w:t xml:space="preserve">Members: Member A, Member B, Member C, Member D · Code: https://github.com/</w:t>
-      </w:r>
-      <w:r>
-        <w:rPr>
-          <w:rFonts w:ascii="Consolas" w:hAnsi="Consolas"/>
-          <w:sz w:val="19"/>
-        </w:rPr>
-        <w:t xml:space="preserve">&lt;username&gt;</w:t>
-      </w:r>
-      <w:r>
-        <w:rPr>
-          <w:sz w:val="19"/>
-        </w:rPr>
-        <w:t xml:space="preserve">/</w:t>
-      </w:r>
-      <w:r>
-        <w:rPr>
-          <w:rFonts w:ascii="Consolas" w:hAnsi="Consolas"/>
-          <w:sz w:val="19"/>
-        </w:rPr>
-        <w:t xml:space="preserve">&lt;repo&gt;</w:t>
+        <w:t xml:space="preserve">Members: Member A, Member B, Member C, Member D · Code: https://github.com/Parick100/nuplan-model-selector</w:t>
       </w:r>
     </w:p>
     <w:p>

</xml_diff>